<commit_message>
docs: update Admin Guide and User Guide for July 2026 changes
Admin/Technician Guide (v2.2):
- New 'Recent System Updates' section covering security fixes,
  Database Administration/Live Monitor rebuild, User Management
  redesign, Forms Builder & Communications changes, and interface
  cleanup since the last doc revision (July 16, 2026)

User Guide (v2.1):
- New 'What's New' section summarizing user-facing changes:
  self-service password change, profile pictures, new request forms,
  Communications nav cleanup, GRN save fix, cleaner page headers
</commit_message>
<xml_diff>
--- a/docs/EL5_MediProcure_Admin_Technician_Guide.docx
+++ b/docs/EL5_MediProcure_Admin_Technician_Guide.docx
@@ -111,7 +111,7 @@
                 <w:sz w:val="20"/>
                 <w:szCs w:val="20"/>
               </w:rPr>
-              <w:t xml:space="preserve">Version 2.1   |   July 2026</w:t>
+              <w:t xml:space="preserve">Version 2.2   |   July 21, 2026</w:t>
             </w:r>
           </w:p>
           <w:p>
@@ -152,6 +152,358 @@
         </w:tc>
       </w:tr>
     </w:tbl>
+    <w:p>
+      <w:pPr>
+        <w:pStyle w:val="Heading1"/>
+        <w:spacing w:after="180" w:before="360"/>
+      </w:pPr>
+      <w:r>
+        <w:rPr>
+          <w:rFonts w:ascii="Arial" w:cs="Arial" w:eastAsia="Arial" w:hAnsi="Arial"/>
+          <w:b/>
+          <w:bCs/>
+          <w:color w:val="0A2558"/>
+          <w:sz w:val="36"/>
+          <w:szCs w:val="36"/>
+        </w:rPr>
+        <w:t xml:space="preserve">Recent System Updates (July 2026)</w:t>
+      </w:r>
+    </w:p>
+    <w:p>
+      <w:pPr>
+        <w:spacing w:after="80" w:before="60"/>
+      </w:pPr>
+      <w:r>
+        <w:rPr>
+          <w:rFonts w:ascii="Arial" w:cs="Arial" w:eastAsia="Arial" w:hAnsi="Arial"/>
+          <w:color w:val="000000"/>
+          <w:sz w:val="22"/>
+          <w:szCs w:val="22"/>
+        </w:rPr>
+        <w:t xml:space="preserve">This section summarizes system changes since the last documentation update (July 16, 2026).</w:t>
+      </w:r>
+    </w:p>
+    <w:p>
+      <w:pPr>
+        <w:pStyle w:val="Heading2"/>
+        <w:pBdr>
+          <w:bottom w:val="single" w:color="0A2558" w:sz="4"/>
+        </w:pBdr>
+        <w:spacing w:after="120" w:before="280"/>
+      </w:pPr>
+      <w:r>
+        <w:rPr>
+          <w:rFonts w:ascii="Arial" w:cs="Arial" w:eastAsia="Arial" w:hAnsi="Arial"/>
+          <w:b/>
+          <w:bCs/>
+          <w:color w:val="1A3A6B"/>
+          <w:sz w:val="28"/>
+          <w:szCs w:val="28"/>
+        </w:rPr>
+        <w:t xml:space="preserve">Security</w:t>
+      </w:r>
+    </w:p>
+    <w:p>
+      <w:pPr>
+        <w:pStyle w:val="ListParagraph"/>
+        <w:numPr>
+          <w:ilvl w:val="0"/>
+          <w:numId w:val="3"/>
+        </w:numPr>
+        <w:spacing w:after="40" w:before="40"/>
+      </w:pPr>
+      <w:r>
+        <w:rPr>
+          <w:rFonts w:ascii="Arial" w:cs="Arial" w:eastAsia="Arial" w:hAnsi="Arial"/>
+          <w:sz w:val="21"/>
+          <w:szCs w:val="21"/>
+        </w:rPr>
+        <w:t xml:space="preserve">Fixed a live plaintext-password leak in the admin password reset flow; plaintext temporary passwords are now purged on a retention schedule.</w:t>
+      </w:r>
+    </w:p>
+    <w:p>
+      <w:pPr>
+        <w:pStyle w:val="ListParagraph"/>
+        <w:numPr>
+          <w:ilvl w:val="0"/>
+          <w:numId w:val="3"/>
+        </w:numPr>
+        <w:spacing w:after="40" w:before="40"/>
+      </w:pPr>
+      <w:r>
+        <w:rPr>
+          <w:rFonts w:ascii="Arial" w:cs="Arial" w:eastAsia="Arial" w:hAnsi="Arial"/>
+          <w:sz w:val="21"/>
+          <w:szCs w:val="21"/>
+        </w:rPr>
+        <w:t xml:space="preserve">Self-service password change: an already-authenticated user can now change their own password directly from their account, without going through the email reset link.</w:t>
+      </w:r>
+    </w:p>
+    <w:p>
+      <w:pPr>
+        <w:pStyle w:val="Heading2"/>
+        <w:pBdr>
+          <w:bottom w:val="single" w:color="0A2558" w:sz="4"/>
+        </w:pBdr>
+        <w:spacing w:after="120" w:before="280"/>
+      </w:pPr>
+      <w:r>
+        <w:rPr>
+          <w:rFonts w:ascii="Arial" w:cs="Arial" w:eastAsia="Arial" w:hAnsi="Arial"/>
+          <w:b/>
+          <w:bCs/>
+          <w:color w:val="1A3A6B"/>
+          <w:sz w:val="28"/>
+          <w:szCs w:val="28"/>
+        </w:rPr>
+        <w:t xml:space="preserve">Database Administration &amp; Live Monitor</w:t>
+      </w:r>
+    </w:p>
+    <w:p>
+      <w:pPr>
+        <w:pStyle w:val="ListParagraph"/>
+        <w:numPr>
+          <w:ilvl w:val="0"/>
+          <w:numId w:val="3"/>
+        </w:numPr>
+        <w:spacing w:after="40" w:before="40"/>
+      </w:pPr>
+      <w:r>
+        <w:rPr>
+          <w:rFonts w:ascii="Arial" w:cs="Arial" w:eastAsia="Arial" w:hAnsi="Arial"/>
+          <w:sz w:val="21"/>
+          <w:szCs w:val="21"/>
+        </w:rPr>
+        <w:t xml:space="preserve">Database Administration reskinned as an SSMS-style tool: new Live Monitor with real per-table stats and dbForge-style overview charts, a Storage Explorer tab, and SQL Editor improvements (job history, print, correct column ordering).</w:t>
+      </w:r>
+    </w:p>
+    <w:p>
+      <w:pPr>
+        <w:pStyle w:val="ListParagraph"/>
+        <w:numPr>
+          <w:ilvl w:val="0"/>
+          <w:numId w:val="3"/>
+        </w:numPr>
+        <w:spacing w:after="40" w:before="40"/>
+      </w:pPr>
+      <w:r>
+        <w:rPr>
+          <w:rFonts w:ascii="Arial" w:cs="Arial" w:eastAsia="Arial" w:hAnsi="Arial"/>
+          <w:sz w:val="21"/>
+          <w:szCs w:val="21"/>
+        </w:rPr>
+        <w:t xml:space="preserve">The old DB Stats and Realtime top-level pages were removed and consolidated into Live Monitor; Top Resource Consumers replaces the old Top Queries view.</w:t>
+      </w:r>
+    </w:p>
+    <w:p>
+      <w:pPr>
+        <w:pStyle w:val="ListParagraph"/>
+        <w:numPr>
+          <w:ilvl w:val="0"/>
+          <w:numId w:val="3"/>
+        </w:numPr>
+        <w:spacing w:after="40" w:before="40"/>
+      </w:pPr>
+      <w:r>
+        <w:rPr>
+          <w:rFonts w:ascii="Arial" w:cs="Arial" w:eastAsia="Arial" w:hAnsi="Arial"/>
+          <w:sz w:val="21"/>
+          <w:szCs w:val="21"/>
+        </w:rPr>
+        <w:t xml:space="preserve">Storage bucket policies and PostgREST schema-cache issues were fixed; delete is now enabled on the remaining storage buckets.</w:t>
+      </w:r>
+    </w:p>
+    <w:p>
+      <w:pPr>
+        <w:pStyle w:val="Heading2"/>
+        <w:pBdr>
+          <w:bottom w:val="single" w:color="0A2558" w:sz="4"/>
+        </w:pBdr>
+        <w:spacing w:after="120" w:before="280"/>
+      </w:pPr>
+      <w:r>
+        <w:rPr>
+          <w:rFonts w:ascii="Arial" w:cs="Arial" w:eastAsia="Arial" w:hAnsi="Arial"/>
+          <w:b/>
+          <w:bCs/>
+          <w:color w:val="1A3A6B"/>
+          <w:sz w:val="28"/>
+          <w:szCs w:val="28"/>
+        </w:rPr>
+        <w:t xml:space="preserve">User Management</w:t>
+      </w:r>
+    </w:p>
+    <w:p>
+      <w:pPr>
+        <w:pStyle w:val="ListParagraph"/>
+        <w:numPr>
+          <w:ilvl w:val="0"/>
+          <w:numId w:val="3"/>
+        </w:numPr>
+        <w:spacing w:after="40" w:before="40"/>
+      </w:pPr>
+      <w:r>
+        <w:rPr>
+          <w:rFonts w:ascii="Arial" w:cs="Arial" w:eastAsia="Arial" w:hAnsi="Arial"/>
+          <w:sz w:val="21"/>
+          <w:szCs w:val="21"/>
+        </w:rPr>
+        <w:t xml:space="preserve">The Users page was redesigned as an SSMS-style Object Explorer, grouped by Department &gt; Role, with per-department icons and real folder icons; the explorer/detail split was fixed on mobile.</w:t>
+      </w:r>
+    </w:p>
+    <w:p>
+      <w:pPr>
+        <w:pStyle w:val="ListParagraph"/>
+        <w:numPr>
+          <w:ilvl w:val="0"/>
+          <w:numId w:val="3"/>
+        </w:numPr>
+        <w:spacing w:after="40" w:before="40"/>
+      </w:pPr>
+      <w:r>
+        <w:rPr>
+          <w:rFonts w:ascii="Arial" w:cs="Arial" w:eastAsia="Arial" w:hAnsi="Arial"/>
+          <w:sz w:val="21"/>
+          <w:szCs w:val="21"/>
+        </w:rPr>
+        <w:t xml:space="preserve">Profile picture support was added for user accounts.</w:t>
+      </w:r>
+    </w:p>
+    <w:p>
+      <w:pPr>
+        <w:pStyle w:val="Heading2"/>
+        <w:pBdr>
+          <w:bottom w:val="single" w:color="0A2558" w:sz="4"/>
+        </w:pBdr>
+        <w:spacing w:after="120" w:before="280"/>
+      </w:pPr>
+      <w:r>
+        <w:rPr>
+          <w:rFonts w:ascii="Arial" w:cs="Arial" w:eastAsia="Arial" w:hAnsi="Arial"/>
+          <w:b/>
+          <w:bCs/>
+          <w:color w:val="1A3A6B"/>
+          <w:sz w:val="28"/>
+          <w:szCs w:val="28"/>
+        </w:rPr>
+        <w:t xml:space="preserve">Forms Builder &amp; Communications</w:t>
+      </w:r>
+    </w:p>
+    <w:p>
+      <w:pPr>
+        <w:pStyle w:val="ListParagraph"/>
+        <w:numPr>
+          <w:ilvl w:val="0"/>
+          <w:numId w:val="3"/>
+        </w:numPr>
+        <w:spacing w:after="40" w:before="40"/>
+      </w:pPr>
+      <w:r>
+        <w:rPr>
+          <w:rFonts w:ascii="Arial" w:cs="Arial" w:eastAsia="Arial" w:hAnsi="Arial"/>
+          <w:sz w:val="21"/>
+          <w:szCs w:val="21"/>
+        </w:rPr>
+        <w:t xml:space="preserve">Forms Builder now supports branding and structured field definitions, and new forms auto-publish on creation.</w:t>
+      </w:r>
+    </w:p>
+    <w:p>
+      <w:pPr>
+        <w:pStyle w:val="ListParagraph"/>
+        <w:numPr>
+          <w:ilvl w:val="0"/>
+          <w:numId w:val="3"/>
+        </w:numPr>
+        <w:spacing w:after="40" w:before="40"/>
+      </w:pPr>
+      <w:r>
+        <w:rPr>
+          <w:rFonts w:ascii="Arial" w:cs="Arial" w:eastAsia="Arial" w:hAnsi="Arial"/>
+          <w:sz w:val="21"/>
+          <w:szCs w:val="21"/>
+        </w:rPr>
+        <w:t xml:space="preserve">Scheduled, branded email sends and Google sign-in on the public answer gate were added; 14 additional clinical, procurement, HR, and admin forms were seeded, and a new All Forms overview table lists every form in one place.</w:t>
+      </w:r>
+    </w:p>
+    <w:p>
+      <w:pPr>
+        <w:pStyle w:val="ListParagraph"/>
+        <w:numPr>
+          <w:ilvl w:val="0"/>
+          <w:numId w:val="3"/>
+        </w:numPr>
+        <w:spacing w:after="40" w:before="40"/>
+      </w:pPr>
+      <w:r>
+        <w:rPr>
+          <w:rFonts w:ascii="Arial" w:cs="Arial" w:eastAsia="Arial" w:hAnsi="Arial"/>
+          <w:sz w:val="21"/>
+          <w:szCs w:val="21"/>
+        </w:rPr>
+        <w:t xml:space="preserve">Email and SMS were consolidated so they appear only under Communications, removing a duplicate entry under Reports &amp; BI.</w:t>
+      </w:r>
+    </w:p>
+    <w:p>
+      <w:pPr>
+        <w:pStyle w:val="Heading2"/>
+        <w:pBdr>
+          <w:bottom w:val="single" w:color="0A2558" w:sz="4"/>
+        </w:pBdr>
+        <w:spacing w:after="120" w:before="280"/>
+      </w:pPr>
+      <w:r>
+        <w:rPr>
+          <w:rFonts w:ascii="Arial" w:cs="Arial" w:eastAsia="Arial" w:hAnsi="Arial"/>
+          <w:b/>
+          <w:bCs/>
+          <w:color w:val="1A3A6B"/>
+          <w:sz w:val="28"/>
+          <w:szCs w:val="28"/>
+        </w:rPr>
+        <w:t xml:space="preserve">Interface Cleanup</w:t>
+      </w:r>
+    </w:p>
+    <w:p>
+      <w:pPr>
+        <w:pStyle w:val="ListParagraph"/>
+        <w:numPr>
+          <w:ilvl w:val="0"/>
+          <w:numId w:val="3"/>
+        </w:numPr>
+        <w:spacing w:after="40" w:before="40"/>
+      </w:pPr>
+      <w:r>
+        <w:rPr>
+          <w:rFonts w:ascii="Arial" w:cs="Arial" w:eastAsia="Arial" w:hAnsi="Arial"/>
+          <w:sz w:val="21"/>
+          <w:szCs w:val="21"/>
+        </w:rPr>
+        <w:t xml:space="preserve">Removed decorative feature-list subtitles (e.g. "Administration · System control · Live IP monitor · User management") from the hero headers on the Admin Panel, Webmaster, Stamp Design, System Report, Tracking &amp; Approval, and Security Center pages for a cleaner, more professional look.</w:t>
+      </w:r>
+    </w:p>
+    <w:p>
+      <w:pPr>
+        <w:pStyle w:val="ListParagraph"/>
+        <w:numPr>
+          <w:ilvl w:val="0"/>
+          <w:numId w:val="3"/>
+        </w:numPr>
+        <w:spacing w:after="40" w:before="40"/>
+      </w:pPr>
+      <w:r>
+        <w:rPr>
+          <w:rFonts w:ascii="Arial" w:cs="Arial" w:eastAsia="Arial" w:hAnsi="Arial"/>
+          <w:sz w:val="21"/>
+          <w:szCs w:val="21"/>
+        </w:rPr>
+        <w:t xml:space="preserve">Server Control was rebuilt with real data and working actions.</w:t>
+      </w:r>
+    </w:p>
+    <w:p>
+      <w:r>
+        <w:br w:type="page"/>
+      </w:r>
+    </w:p>
     <w:p>
       <w:r>
         <w:br w:type="page"/>

</xml_diff>